<commit_message>
eliminacion tablas, ajuste imagenes
</commit_message>
<xml_diff>
--- a/Inputs/Templates/GRI Banorte.docx
+++ b/Inputs/Templates/GRI Banorte.docx
@@ -77,6 +77,7 @@
           <w:lang w:val="es-ES" w:eastAsia="es-ES"/>
         </w:rPr>
       </w:pPr>
+      <w:proofErr w:type="gramStart"/>
       <w:r>
         <w:rPr>
           <w:rFonts w:eastAsia="Times New Roman" w:cstheme="minorHAnsi"/>
@@ -98,7 +99,19 @@
           <w:szCs w:val="24"/>
           <w:lang w:val="es-ES" w:eastAsia="es-ES"/>
         </w:rPr>
-        <w:t>razon_social</w:t>
+        <w:t>razon</w:t>
+      </w:r>
+      <w:proofErr w:type="gramEnd"/>
+      <w:r>
+        <w:rPr>
+          <w:rFonts w:eastAsia="Times New Roman" w:cstheme="minorHAnsi"/>
+          <w:b/>
+          <w:bCs/>
+          <w:sz w:val="24"/>
+          <w:szCs w:val="24"/>
+          <w:lang w:val="es-ES" w:eastAsia="es-ES"/>
+        </w:rPr>
+        <w:t>_social</w:t>
       </w:r>
       <w:proofErr w:type="spellEnd"/>
       <w:r>
@@ -161,6 +174,7 @@
           <w:lang w:val="es-ES"/>
         </w:rPr>
       </w:pPr>
+      <w:proofErr w:type="gramStart"/>
       <w:r>
         <w:rPr>
           <w:b/>
@@ -179,6 +193,7 @@
         <w:t>Direccion</w:t>
       </w:r>
       <w:proofErr w:type="spellEnd"/>
+      <w:proofErr w:type="gramEnd"/>
       <w:r>
         <w:rPr>
           <w:b/>
@@ -251,6 +266,7 @@
           <w:szCs w:val="24"/>
         </w:rPr>
       </w:pPr>
+      <w:proofErr w:type="gramStart"/>
       <w:r>
         <w:rPr>
           <w:b/>
@@ -266,7 +282,16 @@
           <w:sz w:val="24"/>
           <w:szCs w:val="24"/>
         </w:rPr>
-        <w:t>descripcion_actividades</w:t>
+        <w:t>descripcion</w:t>
+      </w:r>
+      <w:proofErr w:type="gramEnd"/>
+      <w:r>
+        <w:rPr>
+          <w:b/>
+          <w:sz w:val="24"/>
+          <w:szCs w:val="24"/>
+        </w:rPr>
+        <w:t>_actividades</w:t>
       </w:r>
       <w:proofErr w:type="spellEnd"/>
       <w:r>
@@ -349,6 +374,7 @@
         </w:rPr>
         <w:t xml:space="preserve">SE CUENTA CON </w:t>
       </w:r>
+      <w:proofErr w:type="gramStart"/>
       <w:r>
         <w:rPr>
           <w:b/>
@@ -356,7 +382,17 @@
           <w:sz w:val="24"/>
           <w:szCs w:val="24"/>
         </w:rPr>
-        <w:t>{{ trabajadores }}</w:t>
+        <w:t>{{ trabajadores</w:t>
+      </w:r>
+      <w:proofErr w:type="gramEnd"/>
+      <w:r>
+        <w:rPr>
+          <w:b/>
+          <w:bCs/>
+          <w:sz w:val="24"/>
+          <w:szCs w:val="24"/>
+        </w:rPr>
+        <w:t xml:space="preserve"> }}</w:t>
       </w:r>
       <w:r>
         <w:rPr>
@@ -467,6 +503,7 @@
         </w:rPr>
         <w:t xml:space="preserve">: </w:t>
       </w:r>
+      <w:proofErr w:type="gramStart"/>
       <w:r>
         <w:rPr>
           <w:b/>
@@ -474,7 +511,17 @@
           <w:sz w:val="24"/>
           <w:szCs w:val="24"/>
         </w:rPr>
-        <w:t>{{ proveedores }}</w:t>
+        <w:t>{{ proveedores</w:t>
+      </w:r>
+      <w:proofErr w:type="gramEnd"/>
+      <w:r>
+        <w:rPr>
+          <w:b/>
+          <w:bCs/>
+          <w:sz w:val="24"/>
+          <w:szCs w:val="24"/>
+        </w:rPr>
+        <w:t xml:space="preserve"> }}</w:t>
       </w:r>
     </w:p>
     <w:p>
@@ -507,7 +554,27 @@
           <w:sz w:val="24"/>
           <w:szCs w:val="24"/>
         </w:rPr>
-        <w:t xml:space="preserve"> {{ visitantes }} VARIABLE</w:t>
+        <w:t xml:space="preserve"> </w:t>
+      </w:r>
+      <w:proofErr w:type="gramStart"/>
+      <w:r>
+        <w:rPr>
+          <w:b/>
+          <w:bCs/>
+          <w:sz w:val="24"/>
+          <w:szCs w:val="24"/>
+        </w:rPr>
+        <w:t>{{ visitantes</w:t>
+      </w:r>
+      <w:proofErr w:type="gramEnd"/>
+      <w:r>
+        <w:rPr>
+          <w:b/>
+          <w:bCs/>
+          <w:sz w:val="24"/>
+          <w:szCs w:val="24"/>
+        </w:rPr>
+        <w:t xml:space="preserve"> }} VARIABLE</w:t>
       </w:r>
     </w:p>
     <w:p>
@@ -546,6 +613,7 @@
       <w:pPr>
         <w:pStyle w:val="Ttulo2"/>
         <w:spacing w:line="240" w:lineRule="auto"/>
+        <w:jc w:val="center"/>
       </w:pPr>
       <w:r>
         <w:rPr>
@@ -559,7 +627,23 @@
           <w:sz w:val="24"/>
           <w:szCs w:val="24"/>
         </w:rPr>
-        <w:t xml:space="preserve">DE {{ construccion_m2 }} </w:t>
+        <w:t xml:space="preserve">DE </w:t>
+      </w:r>
+      <w:proofErr w:type="gramStart"/>
+      <w:r>
+        <w:rPr>
+          <w:sz w:val="24"/>
+          <w:szCs w:val="24"/>
+        </w:rPr>
+        <w:t>{{ construccion</w:t>
+      </w:r>
+      <w:proofErr w:type="gramEnd"/>
+      <w:r>
+        <w:rPr>
+          <w:sz w:val="24"/>
+          <w:szCs w:val="24"/>
+        </w:rPr>
+        <w:t xml:space="preserve">_m2 }} </w:t>
       </w:r>
       <w:r>
         <w:rPr>
@@ -1095,13 +1179,7 @@
                     <w:rPr>
                       <w:rFonts w:ascii="Cambria Math" w:hAnsi="Cambria Math"/>
                     </w:rPr>
-                    <m:t>Inventario</m:t>
-                  </m:r>
-                  <m:r>
-                    <w:rPr>
-                      <w:rFonts w:ascii="Cambria Math" w:hAnsi="Cambria Math"/>
-                    </w:rPr>
-                    <m:t>1</m:t>
+                    <m:t>Inventario1</m:t>
                   </m:r>
                 </m:num>
                 <m:den>
@@ -1109,13 +1187,7 @@
                     <w:rPr>
                       <w:rFonts w:ascii="Cambria Math" w:hAnsi="Cambria Math"/>
                     </w:rPr>
-                    <m:t>Cantidad</m:t>
-                  </m:r>
-                  <m:r>
-                    <w:rPr>
-                      <w:rFonts w:ascii="Cambria Math" w:hAnsi="Cambria Math"/>
-                    </w:rPr>
-                    <m:t>1</m:t>
+                    <m:t>Cantidad1</m:t>
                   </m:r>
                 </m:den>
               </m:f>
@@ -1149,13 +1221,7 @@
                     <w:rPr>
                       <w:rFonts w:ascii="Cambria Math" w:hAnsi="Cambria Math"/>
                     </w:rPr>
-                    <m:t>Inventario</m:t>
-                  </m:r>
-                  <m:r>
-                    <w:rPr>
-                      <w:rFonts w:ascii="Cambria Math" w:hAnsi="Cambria Math"/>
-                    </w:rPr>
-                    <m:t>2</m:t>
+                    <m:t>Inventario2</m:t>
                   </m:r>
                 </m:num>
                 <m:den>
@@ -1163,13 +1229,7 @@
                     <w:rPr>
                       <w:rFonts w:ascii="Cambria Math" w:hAnsi="Cambria Math"/>
                     </w:rPr>
-                    <m:t>Cantidad</m:t>
-                  </m:r>
-                  <m:r>
-                    <w:rPr>
-                      <w:rFonts w:ascii="Cambria Math" w:hAnsi="Cambria Math"/>
-                    </w:rPr>
-                    <m:t>2</m:t>
+                    <m:t>Cantidad2</m:t>
                   </m:r>
                 </m:den>
               </m:f>
@@ -1203,13 +1263,7 @@
                     <w:rPr>
                       <w:rFonts w:ascii="Cambria Math" w:hAnsi="Cambria Math"/>
                     </w:rPr>
-                    <m:t>Inventario</m:t>
-                  </m:r>
-                  <m:r>
-                    <w:rPr>
-                      <w:rFonts w:ascii="Cambria Math" w:hAnsi="Cambria Math"/>
-                    </w:rPr>
-                    <m:t>3</m:t>
+                    <m:t>Inventario3</m:t>
                   </m:r>
                 </m:num>
                 <m:den>
@@ -1217,13 +1271,7 @@
                     <w:rPr>
                       <w:rFonts w:ascii="Cambria Math" w:hAnsi="Cambria Math"/>
                     </w:rPr>
-                    <m:t>Cantidad</m:t>
-                  </m:r>
-                  <m:r>
-                    <w:rPr>
-                      <w:rFonts w:ascii="Cambria Math" w:hAnsi="Cambria Math"/>
-                    </w:rPr>
-                    <m:t>3</m:t>
+                    <m:t>Cantidad3</m:t>
                   </m:r>
                 </m:den>
               </m:f>
@@ -1257,13 +1305,7 @@
                     <w:rPr>
                       <w:rFonts w:ascii="Cambria Math" w:hAnsi="Cambria Math"/>
                     </w:rPr>
-                    <m:t>Inventario</m:t>
-                  </m:r>
-                  <m:r>
-                    <w:rPr>
-                      <w:rFonts w:ascii="Cambria Math" w:hAnsi="Cambria Math"/>
-                    </w:rPr>
-                    <m:t>4</m:t>
+                    <m:t>Inventario4</m:t>
                   </m:r>
                 </m:num>
                 <m:den>
@@ -1271,13 +1313,7 @@
                     <w:rPr>
                       <w:rFonts w:ascii="Cambria Math" w:hAnsi="Cambria Math"/>
                     </w:rPr>
-                    <m:t>Cantidad</m:t>
-                  </m:r>
-                  <m:r>
-                    <w:rPr>
-                      <w:rFonts w:ascii="Cambria Math" w:hAnsi="Cambria Math"/>
-                    </w:rPr>
-                    <m:t>4</m:t>
+                    <m:t>Cantidad4</m:t>
                   </m:r>
                 </m:den>
               </m:f>
@@ -1333,25 +1369,7 @@
                         <w:rPr>
                           <w:rFonts w:ascii="Cambria Math" w:hAnsi="Cambria Math"/>
                         </w:rPr>
-                        <m:t>Inventario</m:t>
-                      </m:r>
-                      <m:r>
-                        <w:rPr>
-                          <w:rFonts w:ascii="Cambria Math" w:hAnsi="Cambria Math"/>
-                        </w:rPr>
-                        <m:t xml:space="preserve"> </m:t>
-                      </m:r>
-                      <m:r>
-                        <w:rPr>
-                          <w:rFonts w:ascii="Cambria Math" w:hAnsi="Cambria Math"/>
-                        </w:rPr>
-                        <m:t>de</m:t>
-                      </m:r>
-                      <m:r>
-                        <w:rPr>
-                          <w:rFonts w:ascii="Cambria Math" w:hAnsi="Cambria Math"/>
-                        </w:rPr>
-                        <m:t xml:space="preserve"> </m:t>
+                        <m:t xml:space="preserve">Inventario de </m:t>
                       </m:r>
                     </m:e>
                     <m:e>
@@ -1359,19 +1377,7 @@
                         <w:rPr>
                           <w:rFonts w:ascii="Cambria Math" w:hAnsi="Cambria Math"/>
                         </w:rPr>
-                        <m:t>gases</m:t>
-                      </m:r>
-                      <m:r>
-                        <w:rPr>
-                          <w:rFonts w:ascii="Cambria Math" w:hAnsi="Cambria Math"/>
-                        </w:rPr>
-                        <m:t xml:space="preserve"> </m:t>
-                      </m:r>
-                      <m:r>
-                        <w:rPr>
-                          <w:rFonts w:ascii="Cambria Math" w:hAnsi="Cambria Math"/>
-                        </w:rPr>
-                        <m:t>inflamables</m:t>
+                        <m:t>gases inflamables</m:t>
                       </m:r>
                     </m:e>
                   </m:eqArr>
@@ -1381,13 +1387,7 @@
                     <w:rPr>
                       <w:rFonts w:ascii="Cambria Math" w:hAnsi="Cambria Math"/>
                     </w:rPr>
-                    <m:t xml:space="preserve">3000 </m:t>
-                  </m:r>
-                  <m:r>
-                    <w:rPr>
-                      <w:rFonts w:ascii="Cambria Math" w:hAnsi="Cambria Math"/>
-                    </w:rPr>
-                    <m:t>litros</m:t>
+                    <m:t>3000 litros</m:t>
                   </m:r>
                 </m:den>
               </m:f>
@@ -1430,19 +1430,7 @@
                         <w:rPr>
                           <w:rFonts w:ascii="Cambria Math" w:hAnsi="Cambria Math"/>
                         </w:rPr>
-                        <m:t>Inventario</m:t>
-                      </m:r>
-                      <m:r>
-                        <w:rPr>
-                          <w:rFonts w:ascii="Cambria Math" w:hAnsi="Cambria Math"/>
-                        </w:rPr>
-                        <m:t xml:space="preserve"> </m:t>
-                      </m:r>
-                      <m:r>
-                        <w:rPr>
-                          <w:rFonts w:ascii="Cambria Math" w:hAnsi="Cambria Math"/>
-                        </w:rPr>
-                        <m:t>de</m:t>
+                        <m:t>Inventario de</m:t>
                       </m:r>
                     </m:e>
                     <m:e>
@@ -1450,31 +1438,7 @@
                         <w:rPr>
                           <w:rFonts w:ascii="Cambria Math" w:hAnsi="Cambria Math"/>
                         </w:rPr>
-                        <m:t>l</m:t>
-                      </m:r>
-                      <m:r>
-                        <w:rPr>
-                          <w:rFonts w:ascii="Cambria Math" w:hAnsi="Cambria Math"/>
-                        </w:rPr>
-                        <m:t>í</m:t>
-                      </m:r>
-                      <m:r>
-                        <w:rPr>
-                          <w:rFonts w:ascii="Cambria Math" w:hAnsi="Cambria Math"/>
-                        </w:rPr>
-                        <m:t>quidos</m:t>
-                      </m:r>
-                      <m:r>
-                        <w:rPr>
-                          <w:rFonts w:ascii="Cambria Math" w:hAnsi="Cambria Math"/>
-                        </w:rPr>
-                        <m:t xml:space="preserve"> </m:t>
-                      </m:r>
-                      <m:r>
-                        <w:rPr>
-                          <w:rFonts w:ascii="Cambria Math" w:hAnsi="Cambria Math"/>
-                        </w:rPr>
-                        <m:t>inflamables</m:t>
+                        <m:t>líquidos inflamables</m:t>
                       </m:r>
                     </m:e>
                   </m:eqArr>
@@ -1484,13 +1448,7 @@
                     <w:rPr>
                       <w:rFonts w:ascii="Cambria Math" w:hAnsi="Cambria Math"/>
                     </w:rPr>
-                    <m:t xml:space="preserve">1400 </m:t>
-                  </m:r>
-                  <m:r>
-                    <w:rPr>
-                      <w:rFonts w:ascii="Cambria Math" w:hAnsi="Cambria Math"/>
-                    </w:rPr>
-                    <m:t>litros</m:t>
+                    <m:t>1400 litros</m:t>
                   </m:r>
                 </m:den>
               </m:f>
@@ -1533,19 +1491,7 @@
                         <w:rPr>
                           <w:rFonts w:ascii="Cambria Math" w:hAnsi="Cambria Math"/>
                         </w:rPr>
-                        <m:t>Inventario</m:t>
-                      </m:r>
-                      <m:r>
-                        <w:rPr>
-                          <w:rFonts w:ascii="Cambria Math" w:hAnsi="Cambria Math"/>
-                        </w:rPr>
-                        <m:t xml:space="preserve"> </m:t>
-                      </m:r>
-                      <m:r>
-                        <w:rPr>
-                          <w:rFonts w:ascii="Cambria Math" w:hAnsi="Cambria Math"/>
-                        </w:rPr>
-                        <m:t>de</m:t>
+                        <m:t>Inventario de</m:t>
                       </m:r>
                     </m:e>
                     <m:e>
@@ -1553,31 +1499,7 @@
                         <w:rPr>
                           <w:rFonts w:ascii="Cambria Math" w:hAnsi="Cambria Math"/>
                         </w:rPr>
-                        <m:t>l</m:t>
-                      </m:r>
-                      <m:r>
-                        <w:rPr>
-                          <w:rFonts w:ascii="Cambria Math" w:hAnsi="Cambria Math"/>
-                        </w:rPr>
-                        <m:t>í</m:t>
-                      </m:r>
-                      <m:r>
-                        <w:rPr>
-                          <w:rFonts w:ascii="Cambria Math" w:hAnsi="Cambria Math"/>
-                        </w:rPr>
-                        <m:t>quidos</m:t>
-                      </m:r>
-                      <m:r>
-                        <w:rPr>
-                          <w:rFonts w:ascii="Cambria Math" w:hAnsi="Cambria Math"/>
-                        </w:rPr>
-                        <m:t xml:space="preserve"> </m:t>
-                      </m:r>
-                      <m:r>
-                        <w:rPr>
-                          <w:rFonts w:ascii="Cambria Math" w:hAnsi="Cambria Math"/>
-                        </w:rPr>
-                        <m:t>combustibles</m:t>
+                        <m:t>líquidos combustibles</m:t>
                       </m:r>
                     </m:e>
                   </m:eqArr>
@@ -1587,13 +1509,7 @@
                     <w:rPr>
                       <w:rFonts w:ascii="Cambria Math" w:hAnsi="Cambria Math"/>
                     </w:rPr>
-                    <m:t xml:space="preserve">2000 </m:t>
-                  </m:r>
-                  <m:r>
-                    <w:rPr>
-                      <w:rFonts w:ascii="Cambria Math" w:hAnsi="Cambria Math"/>
-                    </w:rPr>
-                    <m:t>litros</m:t>
+                    <m:t>2000 litros</m:t>
                   </m:r>
                 </m:den>
               </m:f>
@@ -1636,19 +1552,7 @@
                         <w:rPr>
                           <w:rFonts w:ascii="Cambria Math" w:hAnsi="Cambria Math"/>
                         </w:rPr>
-                        <m:t>Inventario</m:t>
-                      </m:r>
-                      <m:r>
-                        <w:rPr>
-                          <w:rFonts w:ascii="Cambria Math" w:hAnsi="Cambria Math"/>
-                        </w:rPr>
-                        <m:t xml:space="preserve"> </m:t>
-                      </m:r>
-                      <m:r>
-                        <w:rPr>
-                          <w:rFonts w:ascii="Cambria Math" w:hAnsi="Cambria Math"/>
-                        </w:rPr>
-                        <m:t>de</m:t>
+                        <m:t>Inventario de</m:t>
                       </m:r>
                     </m:e>
                     <m:e>
@@ -1656,31 +1560,7 @@
                         <w:rPr>
                           <w:rFonts w:ascii="Cambria Math" w:hAnsi="Cambria Math"/>
                         </w:rPr>
-                        <m:t>s</m:t>
-                      </m:r>
-                      <m:r>
-                        <w:rPr>
-                          <w:rFonts w:ascii="Cambria Math" w:hAnsi="Cambria Math"/>
-                        </w:rPr>
-                        <m:t>ó</m:t>
-                      </m:r>
-                      <m:r>
-                        <w:rPr>
-                          <w:rFonts w:ascii="Cambria Math" w:hAnsi="Cambria Math"/>
-                        </w:rPr>
-                        <m:t>lidos</m:t>
-                      </m:r>
-                      <m:r>
-                        <w:rPr>
-                          <w:rFonts w:ascii="Cambria Math" w:hAnsi="Cambria Math"/>
-                        </w:rPr>
-                        <m:t xml:space="preserve"> </m:t>
-                      </m:r>
-                      <m:r>
-                        <w:rPr>
-                          <w:rFonts w:ascii="Cambria Math" w:hAnsi="Cambria Math"/>
-                        </w:rPr>
-                        <m:t>combustibles</m:t>
+                        <m:t>sólidos combustibles</m:t>
                       </m:r>
                     </m:e>
                   </m:eqArr>
@@ -1690,13 +1570,7 @@
                     <w:rPr>
                       <w:rFonts w:ascii="Cambria Math" w:hAnsi="Cambria Math"/>
                     </w:rPr>
-                    <m:t xml:space="preserve">15000 </m:t>
-                  </m:r>
-                  <m:r>
-                    <w:rPr>
-                      <w:rFonts w:ascii="Cambria Math" w:hAnsi="Cambria Math"/>
-                    </w:rPr>
-                    <m:t>kilogramos</m:t>
+                    <m:t>15000 kilogramos</m:t>
                   </m:r>
                 </m:den>
               </m:f>
@@ -1779,13 +1653,7 @@
                     <w:rPr>
                       <w:rFonts w:ascii="Cambria Math" w:hAnsi="Cambria Math"/>
                     </w:rPr>
-                    <m:t>Inventario</m:t>
-                  </m:r>
-                  <m:r>
-                    <w:rPr>
-                      <w:rFonts w:ascii="Cambria Math" w:hAnsi="Cambria Math"/>
-                    </w:rPr>
-                    <m:t>1</m:t>
+                    <m:t>Inventario1</m:t>
                   </m:r>
                 </m:num>
                 <m:den>
@@ -1793,13 +1661,7 @@
                     <w:rPr>
                       <w:rFonts w:ascii="Cambria Math" w:hAnsi="Cambria Math"/>
                     </w:rPr>
-                    <m:t>Cantidad</m:t>
-                  </m:r>
-                  <m:r>
-                    <w:rPr>
-                      <w:rFonts w:ascii="Cambria Math" w:hAnsi="Cambria Math"/>
-                    </w:rPr>
-                    <m:t>1</m:t>
+                    <m:t>Cantidad1</m:t>
                   </m:r>
                 </m:den>
               </m:f>
@@ -1833,13 +1695,7 @@
                     <w:rPr>
                       <w:rFonts w:ascii="Cambria Math" w:hAnsi="Cambria Math"/>
                     </w:rPr>
-                    <m:t>Inventario</m:t>
-                  </m:r>
-                  <m:r>
-                    <w:rPr>
-                      <w:rFonts w:ascii="Cambria Math" w:hAnsi="Cambria Math"/>
-                    </w:rPr>
-                    <m:t>2</m:t>
+                    <m:t>Inventario2</m:t>
                   </m:r>
                 </m:num>
                 <m:den>
@@ -1847,13 +1703,7 @@
                     <w:rPr>
                       <w:rFonts w:ascii="Cambria Math" w:hAnsi="Cambria Math"/>
                     </w:rPr>
-                    <m:t>Cantidad</m:t>
-                  </m:r>
-                  <m:r>
-                    <w:rPr>
-                      <w:rFonts w:ascii="Cambria Math" w:hAnsi="Cambria Math"/>
-                    </w:rPr>
-                    <m:t>2</m:t>
+                    <m:t>Cantidad2</m:t>
                   </m:r>
                 </m:den>
               </m:f>
@@ -1887,13 +1737,7 @@
                     <w:rPr>
                       <w:rFonts w:ascii="Cambria Math" w:hAnsi="Cambria Math"/>
                     </w:rPr>
-                    <m:t>Inventario</m:t>
-                  </m:r>
-                  <m:r>
-                    <w:rPr>
-                      <w:rFonts w:ascii="Cambria Math" w:hAnsi="Cambria Math"/>
-                    </w:rPr>
-                    <m:t>3</m:t>
+                    <m:t>Inventario3</m:t>
                   </m:r>
                 </m:num>
                 <m:den>
@@ -1901,13 +1745,7 @@
                     <w:rPr>
                       <w:rFonts w:ascii="Cambria Math" w:hAnsi="Cambria Math"/>
                     </w:rPr>
-                    <m:t>Cantidad</m:t>
-                  </m:r>
-                  <m:r>
-                    <w:rPr>
-                      <w:rFonts w:ascii="Cambria Math" w:hAnsi="Cambria Math"/>
-                    </w:rPr>
-                    <m:t>3</m:t>
+                    <m:t>Cantidad3</m:t>
                   </m:r>
                 </m:den>
               </m:f>
@@ -1941,13 +1779,7 @@
                     <w:rPr>
                       <w:rFonts w:ascii="Cambria Math" w:hAnsi="Cambria Math"/>
                     </w:rPr>
-                    <m:t>Inventario</m:t>
-                  </m:r>
-                  <m:r>
-                    <w:rPr>
-                      <w:rFonts w:ascii="Cambria Math" w:hAnsi="Cambria Math"/>
-                    </w:rPr>
-                    <m:t>4</m:t>
+                    <m:t>Inventario4</m:t>
                   </m:r>
                 </m:num>
                 <m:den>
@@ -1955,13 +1787,7 @@
                     <w:rPr>
                       <w:rFonts w:ascii="Cambria Math" w:hAnsi="Cambria Math"/>
                     </w:rPr>
-                    <m:t>Cantidad</m:t>
-                  </m:r>
-                  <m:r>
-                    <w:rPr>
-                      <w:rFonts w:ascii="Cambria Math" w:hAnsi="Cambria Math"/>
-                    </w:rPr>
-                    <m:t>4</m:t>
+                    <m:t>Cantidad4</m:t>
                   </m:r>
                 </m:den>
               </m:f>
@@ -2014,13 +1840,7 @@
                     <w:rPr>
                       <w:rFonts w:ascii="Cambria Math" w:hAnsi="Cambria Math"/>
                     </w:rPr>
-                    <m:t>Inventario</m:t>
-                  </m:r>
-                  <m:r>
-                    <w:rPr>
-                      <w:rFonts w:ascii="Cambria Math" w:hAnsi="Cambria Math"/>
-                    </w:rPr>
-                    <m:t>1</m:t>
+                    <m:t>Inventario1</m:t>
                   </m:r>
                 </m:num>
                 <m:den>
@@ -2028,13 +1848,7 @@
                     <w:rPr>
                       <w:rFonts w:ascii="Cambria Math" w:hAnsi="Cambria Math"/>
                     </w:rPr>
-                    <m:t>Cantidad</m:t>
-                  </m:r>
-                  <m:r>
-                    <w:rPr>
-                      <w:rFonts w:ascii="Cambria Math" w:hAnsi="Cambria Math"/>
-                    </w:rPr>
-                    <m:t>1</m:t>
+                    <m:t>Cantidad1</m:t>
                   </m:r>
                 </m:den>
               </m:f>
@@ -2068,13 +1882,7 @@
                     <w:rPr>
                       <w:rFonts w:ascii="Cambria Math" w:hAnsi="Cambria Math"/>
                     </w:rPr>
-                    <m:t>Inventario</m:t>
-                  </m:r>
-                  <m:r>
-                    <w:rPr>
-                      <w:rFonts w:ascii="Cambria Math" w:hAnsi="Cambria Math"/>
-                    </w:rPr>
-                    <m:t>2</m:t>
+                    <m:t>Inventario2</m:t>
                   </m:r>
                 </m:num>
                 <m:den>
@@ -2082,13 +1890,7 @@
                     <w:rPr>
                       <w:rFonts w:ascii="Cambria Math" w:hAnsi="Cambria Math"/>
                     </w:rPr>
-                    <m:t>Cantidad</m:t>
-                  </m:r>
-                  <m:r>
-                    <w:rPr>
-                      <w:rFonts w:ascii="Cambria Math" w:hAnsi="Cambria Math"/>
-                    </w:rPr>
-                    <m:t>2</m:t>
+                    <m:t>Cantidad2</m:t>
                   </m:r>
                 </m:den>
               </m:f>
@@ -2122,13 +1924,7 @@
                     <w:rPr>
                       <w:rFonts w:ascii="Cambria Math" w:hAnsi="Cambria Math"/>
                     </w:rPr>
-                    <m:t>Inventario</m:t>
-                  </m:r>
-                  <m:r>
-                    <w:rPr>
-                      <w:rFonts w:ascii="Cambria Math" w:hAnsi="Cambria Math"/>
-                    </w:rPr>
-                    <m:t>3</m:t>
+                    <m:t>Inventario3</m:t>
                   </m:r>
                 </m:num>
                 <m:den>
@@ -2136,13 +1932,7 @@
                     <w:rPr>
                       <w:rFonts w:ascii="Cambria Math" w:hAnsi="Cambria Math"/>
                     </w:rPr>
-                    <m:t>Cantidad</m:t>
-                  </m:r>
-                  <m:r>
-                    <w:rPr>
-                      <w:rFonts w:ascii="Cambria Math" w:hAnsi="Cambria Math"/>
-                    </w:rPr>
-                    <m:t>3</m:t>
+                    <m:t>Cantidad3</m:t>
                   </m:r>
                 </m:den>
               </m:f>
@@ -2176,13 +1966,7 @@
                     <w:rPr>
                       <w:rFonts w:ascii="Cambria Math" w:hAnsi="Cambria Math"/>
                     </w:rPr>
-                    <m:t>Inventario</m:t>
-                  </m:r>
-                  <m:r>
-                    <w:rPr>
-                      <w:rFonts w:ascii="Cambria Math" w:hAnsi="Cambria Math"/>
-                    </w:rPr>
-                    <m:t>4</m:t>
+                    <m:t>Inventario4</m:t>
                   </m:r>
                 </m:num>
                 <m:den>
@@ -2190,13 +1974,7 @@
                     <w:rPr>
                       <w:rFonts w:ascii="Cambria Math" w:hAnsi="Cambria Math"/>
                     </w:rPr>
-                    <m:t>Cantidad</m:t>
-                  </m:r>
-                  <m:r>
-                    <w:rPr>
-                      <w:rFonts w:ascii="Cambria Math" w:hAnsi="Cambria Math"/>
-                    </w:rPr>
-                    <m:t>4</m:t>
+                    <m:t>Cantidad4</m:t>
                   </m:r>
                 </m:den>
               </m:f>
@@ -2424,6 +2202,7 @@
                 <w:lang w:eastAsia="es-MX"/>
               </w:rPr>
             </w:pPr>
+            <w:proofErr w:type="gramStart"/>
             <w:r>
               <w:rPr>
                 <w:rFonts w:ascii="Calibri" w:eastAsia="Times New Roman" w:hAnsi="Calibri" w:cs="Calibri"/>
@@ -2447,7 +2226,20 @@
                 <w:szCs w:val="18"/>
                 <w:lang w:eastAsia="es-MX"/>
               </w:rPr>
-              <w:t>razon_social</w:t>
+              <w:t>razon</w:t>
+            </w:r>
+            <w:proofErr w:type="gramEnd"/>
+            <w:r>
+              <w:rPr>
+                <w:rFonts w:ascii="Calibri" w:eastAsia="Times New Roman" w:hAnsi="Calibri" w:cs="Calibri"/>
+                <w:b/>
+                <w:bCs/>
+                <w:color w:val="000000"/>
+                <w:sz w:val="18"/>
+                <w:szCs w:val="18"/>
+                <w:lang w:eastAsia="es-MX"/>
+              </w:rPr>
+              <w:t>_social</w:t>
             </w:r>
             <w:proofErr w:type="spellEnd"/>
             <w:r>
@@ -2542,6 +2334,7 @@
                 <w:lang w:eastAsia="es-MX"/>
               </w:rPr>
             </w:pPr>
+            <w:proofErr w:type="gramStart"/>
             <w:r>
               <w:rPr>
                 <w:rFonts w:ascii="Calibri" w:eastAsia="Times New Roman" w:hAnsi="Calibri" w:cs="Calibri"/>
@@ -2568,6 +2361,7 @@
               <w:t>Direccion</w:t>
             </w:r>
             <w:proofErr w:type="spellEnd"/>
+            <w:proofErr w:type="gramEnd"/>
             <w:r>
               <w:rPr>
                 <w:rFonts w:ascii="Calibri" w:eastAsia="Times New Roman" w:hAnsi="Calibri" w:cs="Calibri"/>
@@ -2672,6 +2466,7 @@
                 <w:lang w:eastAsia="es-MX"/>
               </w:rPr>
             </w:pPr>
+            <w:proofErr w:type="gramStart"/>
             <w:r>
               <w:rPr>
                 <w:rFonts w:ascii="Calibri" w:eastAsia="Times New Roman" w:hAnsi="Calibri" w:cs="Calibri"/>
@@ -2695,7 +2490,20 @@
                 <w:szCs w:val="18"/>
                 <w:lang w:eastAsia="es-MX"/>
               </w:rPr>
-              <w:t>giro_comercial</w:t>
+              <w:t>giro</w:t>
+            </w:r>
+            <w:proofErr w:type="gramEnd"/>
+            <w:r>
+              <w:rPr>
+                <w:rFonts w:ascii="Calibri" w:eastAsia="Times New Roman" w:hAnsi="Calibri" w:cs="Calibri"/>
+                <w:b/>
+                <w:bCs/>
+                <w:color w:val="000000"/>
+                <w:sz w:val="18"/>
+                <w:szCs w:val="18"/>
+                <w:lang w:eastAsia="es-MX"/>
+              </w:rPr>
+              <w:t>_comercial</w:t>
             </w:r>
             <w:proofErr w:type="spellEnd"/>
             <w:r>
@@ -2744,6 +2552,7 @@
                 <w:lang w:eastAsia="es-MX"/>
               </w:rPr>
             </w:pPr>
+            <w:proofErr w:type="gramStart"/>
             <w:r>
               <w:rPr>
                 <w:rFonts w:ascii="Calibri" w:eastAsia="Times New Roman" w:hAnsi="Calibri" w:cs="Calibri"/>
@@ -2763,7 +2572,18 @@
                 <w:szCs w:val="18"/>
                 <w:lang w:eastAsia="es-MX"/>
               </w:rPr>
-              <w:t>nombre_comercial</w:t>
+              <w:t>nombre</w:t>
+            </w:r>
+            <w:proofErr w:type="gramEnd"/>
+            <w:r>
+              <w:rPr>
+                <w:rFonts w:ascii="Calibri" w:eastAsia="Times New Roman" w:hAnsi="Calibri" w:cs="Calibri"/>
+                <w:color w:val="000000"/>
+                <w:sz w:val="18"/>
+                <w:szCs w:val="18"/>
+                <w:lang w:eastAsia="es-MX"/>
+              </w:rPr>
+              <w:t>_comercial</w:t>
             </w:r>
             <w:proofErr w:type="spellEnd"/>
             <w:r>
@@ -3587,6 +3407,7 @@
                 <w:lang w:eastAsia="es-MX"/>
               </w:rPr>
             </w:pPr>
+            <w:proofErr w:type="gramStart"/>
             <w:r>
               <w:rPr>
                 <w:rFonts w:ascii="Calibri" w:eastAsia="Times New Roman" w:hAnsi="Calibri" w:cs="Calibri"/>
@@ -3606,7 +3427,18 @@
                 <w:szCs w:val="18"/>
                 <w:lang w:eastAsia="es-MX"/>
               </w:rPr>
-              <w:t>descripcion_gas_inflamable</w:t>
+              <w:t>descripcion</w:t>
+            </w:r>
+            <w:proofErr w:type="gramEnd"/>
+            <w:r>
+              <w:rPr>
+                <w:rFonts w:ascii="Calibri" w:eastAsia="Times New Roman" w:hAnsi="Calibri" w:cs="Calibri"/>
+                <w:color w:val="000000"/>
+                <w:sz w:val="18"/>
+                <w:szCs w:val="18"/>
+                <w:lang w:eastAsia="es-MX"/>
+              </w:rPr>
+              <w:t>_gas_inflamable</w:t>
             </w:r>
             <w:proofErr w:type="spellEnd"/>
             <w:r>
@@ -3648,6 +3480,7 @@
                 <w:lang w:eastAsia="es-MX"/>
               </w:rPr>
             </w:pPr>
+            <w:proofErr w:type="gramStart"/>
             <w:r>
               <w:rPr>
                 <w:rFonts w:ascii="Calibri" w:eastAsia="Times New Roman" w:hAnsi="Calibri" w:cs="Calibri"/>
@@ -3667,7 +3500,18 @@
                 <w:szCs w:val="18"/>
                 <w:lang w:eastAsia="es-MX"/>
               </w:rPr>
-              <w:t>gas_inflamable</w:t>
+              <w:t>gas</w:t>
+            </w:r>
+            <w:proofErr w:type="gramEnd"/>
+            <w:r>
+              <w:rPr>
+                <w:rFonts w:ascii="Calibri" w:eastAsia="Times New Roman" w:hAnsi="Calibri" w:cs="Calibri"/>
+                <w:color w:val="000000"/>
+                <w:sz w:val="18"/>
+                <w:szCs w:val="18"/>
+                <w:lang w:eastAsia="es-MX"/>
+              </w:rPr>
+              <w:t>_inflamable</w:t>
             </w:r>
             <w:proofErr w:type="spellEnd"/>
             <w:r>
@@ -3970,6 +3814,7 @@
                 <w:lang w:eastAsia="es-MX"/>
               </w:rPr>
             </w:pPr>
+            <w:proofErr w:type="gramStart"/>
             <w:r>
               <w:rPr>
                 <w:rFonts w:ascii="Calibri" w:eastAsia="Times New Roman" w:hAnsi="Calibri" w:cs="Calibri"/>
@@ -3989,7 +3834,18 @@
                 <w:szCs w:val="18"/>
                 <w:lang w:eastAsia="es-MX"/>
               </w:rPr>
-              <w:t>descripcion_liquido_inflamable</w:t>
+              <w:t>descripcion</w:t>
+            </w:r>
+            <w:proofErr w:type="gramEnd"/>
+            <w:r>
+              <w:rPr>
+                <w:rFonts w:ascii="Calibri" w:eastAsia="Times New Roman" w:hAnsi="Calibri" w:cs="Calibri"/>
+                <w:color w:val="000000"/>
+                <w:sz w:val="18"/>
+                <w:szCs w:val="18"/>
+                <w:lang w:eastAsia="es-MX"/>
+              </w:rPr>
+              <w:t>_liquido_inflamable</w:t>
             </w:r>
             <w:proofErr w:type="spellEnd"/>
             <w:r>
@@ -4031,6 +3887,7 @@
                 <w:lang w:eastAsia="es-MX"/>
               </w:rPr>
             </w:pPr>
+            <w:proofErr w:type="gramStart"/>
             <w:r>
               <w:rPr>
                 <w:rFonts w:ascii="Calibri" w:eastAsia="Times New Roman" w:hAnsi="Calibri" w:cs="Calibri"/>
@@ -4050,7 +3907,18 @@
                 <w:szCs w:val="18"/>
                 <w:lang w:eastAsia="es-MX"/>
               </w:rPr>
-              <w:t>liquido_inflamable</w:t>
+              <w:t>liquido</w:t>
+            </w:r>
+            <w:proofErr w:type="gramEnd"/>
+            <w:r>
+              <w:rPr>
+                <w:rFonts w:ascii="Calibri" w:eastAsia="Times New Roman" w:hAnsi="Calibri" w:cs="Calibri"/>
+                <w:color w:val="000000"/>
+                <w:sz w:val="18"/>
+                <w:szCs w:val="18"/>
+                <w:lang w:eastAsia="es-MX"/>
+              </w:rPr>
+              <w:t>_inflamable</w:t>
             </w:r>
             <w:proofErr w:type="spellEnd"/>
             <w:r>
@@ -4353,6 +4221,7 @@
                 <w:lang w:eastAsia="es-MX"/>
               </w:rPr>
             </w:pPr>
+            <w:proofErr w:type="gramStart"/>
             <w:r>
               <w:rPr>
                 <w:rFonts w:ascii="Calibri" w:eastAsia="Times New Roman" w:hAnsi="Calibri" w:cs="Calibri"/>
@@ -4372,7 +4241,18 @@
                 <w:szCs w:val="18"/>
                 <w:lang w:eastAsia="es-MX"/>
               </w:rPr>
-              <w:t>descripcion_liquido_combustible</w:t>
+              <w:t>descripcion</w:t>
+            </w:r>
+            <w:proofErr w:type="gramEnd"/>
+            <w:r>
+              <w:rPr>
+                <w:rFonts w:ascii="Calibri" w:eastAsia="Times New Roman" w:hAnsi="Calibri" w:cs="Calibri"/>
+                <w:color w:val="000000"/>
+                <w:sz w:val="18"/>
+                <w:szCs w:val="18"/>
+                <w:lang w:eastAsia="es-MX"/>
+              </w:rPr>
+              <w:t>_liquido_combustible</w:t>
             </w:r>
             <w:proofErr w:type="spellEnd"/>
             <w:r>
@@ -4413,6 +4293,7 @@
                 <w:lang w:eastAsia="es-MX"/>
               </w:rPr>
             </w:pPr>
+            <w:proofErr w:type="gramStart"/>
             <w:r>
               <w:rPr>
                 <w:rFonts w:ascii="Calibri" w:eastAsia="Times New Roman" w:hAnsi="Calibri" w:cs="Calibri"/>
@@ -4432,7 +4313,18 @@
                 <w:szCs w:val="18"/>
                 <w:lang w:eastAsia="es-MX"/>
               </w:rPr>
-              <w:t>liquido_combustible</w:t>
+              <w:t>liquido</w:t>
+            </w:r>
+            <w:proofErr w:type="gramEnd"/>
+            <w:r>
+              <w:rPr>
+                <w:rFonts w:ascii="Calibri" w:eastAsia="Times New Roman" w:hAnsi="Calibri" w:cs="Calibri"/>
+                <w:color w:val="000000"/>
+                <w:sz w:val="18"/>
+                <w:szCs w:val="18"/>
+                <w:lang w:eastAsia="es-MX"/>
+              </w:rPr>
+              <w:t>_combustible</w:t>
             </w:r>
             <w:proofErr w:type="spellEnd"/>
             <w:r>
@@ -4744,6 +4636,7 @@
                 <w:lang w:eastAsia="es-MX"/>
               </w:rPr>
             </w:pPr>
+            <w:proofErr w:type="gramStart"/>
             <w:r>
               <w:rPr>
                 <w:rFonts w:ascii="Calibri" w:eastAsia="Times New Roman" w:hAnsi="Calibri" w:cs="Calibri"/>
@@ -4763,7 +4656,18 @@
                 <w:szCs w:val="18"/>
                 <w:lang w:eastAsia="es-MX"/>
               </w:rPr>
-              <w:t>descripcion_solido_combustible</w:t>
+              <w:t>descripcion</w:t>
+            </w:r>
+            <w:proofErr w:type="gramEnd"/>
+            <w:r>
+              <w:rPr>
+                <w:rFonts w:ascii="Calibri" w:eastAsia="Times New Roman" w:hAnsi="Calibri" w:cs="Calibri"/>
+                <w:color w:val="000000"/>
+                <w:sz w:val="18"/>
+                <w:szCs w:val="18"/>
+                <w:lang w:eastAsia="es-MX"/>
+              </w:rPr>
+              <w:t>_solido_combustible</w:t>
             </w:r>
             <w:proofErr w:type="spellEnd"/>
             <w:r>
@@ -4804,6 +4708,7 @@
                 <w:lang w:eastAsia="es-MX"/>
               </w:rPr>
             </w:pPr>
+            <w:proofErr w:type="gramStart"/>
             <w:r>
               <w:rPr>
                 <w:rFonts w:ascii="Calibri" w:eastAsia="Times New Roman" w:hAnsi="Calibri" w:cs="Calibri"/>
@@ -4823,7 +4728,18 @@
                 <w:szCs w:val="18"/>
                 <w:lang w:eastAsia="es-MX"/>
               </w:rPr>
-              <w:t>solido_combusible</w:t>
+              <w:t>solido</w:t>
+            </w:r>
+            <w:proofErr w:type="gramEnd"/>
+            <w:r>
+              <w:rPr>
+                <w:rFonts w:ascii="Calibri" w:eastAsia="Times New Roman" w:hAnsi="Calibri" w:cs="Calibri"/>
+                <w:color w:val="000000"/>
+                <w:sz w:val="18"/>
+                <w:szCs w:val="18"/>
+                <w:lang w:eastAsia="es-MX"/>
+              </w:rPr>
+              <w:t>_combustible</w:t>
             </w:r>
             <w:proofErr w:type="spellEnd"/>
             <w:r>
@@ -5032,6 +4948,7 @@
                 <w:lang w:eastAsia="es-MX"/>
               </w:rPr>
             </w:pPr>
+            <w:proofErr w:type="gramStart"/>
             <w:r>
               <w:rPr>
                 <w:rFonts w:ascii="Calibri" w:eastAsia="Times New Roman" w:hAnsi="Calibri" w:cs="Calibri"/>
@@ -5042,7 +4959,20 @@
                 <w:szCs w:val="18"/>
                 <w:lang w:eastAsia="es-MX"/>
               </w:rPr>
-              <w:t>{{ turnos }}</w:t>
+              <w:t>{{ turnos</w:t>
+            </w:r>
+            <w:proofErr w:type="gramEnd"/>
+            <w:r>
+              <w:rPr>
+                <w:rFonts w:ascii="Calibri" w:eastAsia="Times New Roman" w:hAnsi="Calibri" w:cs="Calibri"/>
+                <w:b/>
+                <w:bCs/>
+                <w:color w:val="000000"/>
+                <w:sz w:val="18"/>
+                <w:szCs w:val="18"/>
+                <w:lang w:eastAsia="es-MX"/>
+              </w:rPr>
+              <w:t xml:space="preserve"> }}</w:t>
             </w:r>
           </w:p>
         </w:tc>
@@ -5112,6 +5042,7 @@
                 <w:lang w:eastAsia="es-MX"/>
               </w:rPr>
             </w:pPr>
+            <w:proofErr w:type="gramStart"/>
             <w:r>
               <w:rPr>
                 <w:rFonts w:ascii="Calibri" w:eastAsia="Times New Roman" w:hAnsi="Calibri" w:cs="Calibri"/>
@@ -5122,7 +5053,20 @@
                 <w:szCs w:val="18"/>
                 <w:lang w:eastAsia="es-MX"/>
               </w:rPr>
-              <w:t>{{ trabajadores }}</w:t>
+              <w:t>{{ trabajadores</w:t>
+            </w:r>
+            <w:proofErr w:type="gramEnd"/>
+            <w:r>
+              <w:rPr>
+                <w:rFonts w:ascii="Calibri" w:eastAsia="Times New Roman" w:hAnsi="Calibri" w:cs="Calibri"/>
+                <w:b/>
+                <w:bCs/>
+                <w:color w:val="000000"/>
+                <w:sz w:val="18"/>
+                <w:szCs w:val="18"/>
+                <w:lang w:eastAsia="es-MX"/>
+              </w:rPr>
+              <w:t xml:space="preserve"> }}</w:t>
             </w:r>
           </w:p>
         </w:tc>
@@ -5194,6 +5138,7 @@
                 <w:lang w:eastAsia="es-MX"/>
               </w:rPr>
             </w:pPr>
+            <w:proofErr w:type="gramStart"/>
             <w:r>
               <w:rPr>
                 <w:rFonts w:ascii="Calibri" w:eastAsia="Times New Roman" w:hAnsi="Calibri" w:cs="Calibri"/>
@@ -5204,7 +5149,20 @@
                 <w:szCs w:val="18"/>
                 <w:lang w:eastAsia="es-MX"/>
               </w:rPr>
-              <w:t>{{ flotante }}</w:t>
+              <w:t>{{ flotante</w:t>
+            </w:r>
+            <w:proofErr w:type="gramEnd"/>
+            <w:r>
+              <w:rPr>
+                <w:rFonts w:ascii="Calibri" w:eastAsia="Times New Roman" w:hAnsi="Calibri" w:cs="Calibri"/>
+                <w:b/>
+                <w:bCs/>
+                <w:color w:val="000000"/>
+                <w:sz w:val="18"/>
+                <w:szCs w:val="18"/>
+                <w:lang w:eastAsia="es-MX"/>
+              </w:rPr>
+              <w:t xml:space="preserve"> }}</w:t>
             </w:r>
           </w:p>
         </w:tc>
@@ -5443,6 +5401,7 @@
                 <w:lang w:eastAsia="es-MX"/>
               </w:rPr>
             </w:pPr>
+            <w:proofErr w:type="gramStart"/>
             <w:r>
               <w:rPr>
                 <w:sz w:val="18"/>
@@ -5456,7 +5415,15 @@
                 <w:sz w:val="18"/>
                 <w:szCs w:val="18"/>
               </w:rPr>
-              <w:t>valor_gas_inflamable</w:t>
+              <w:t>valor</w:t>
+            </w:r>
+            <w:proofErr w:type="gramEnd"/>
+            <w:r>
+              <w:rPr>
+                <w:sz w:val="18"/>
+                <w:szCs w:val="18"/>
+              </w:rPr>
+              <w:t>_gas_inflamable</w:t>
             </w:r>
             <w:proofErr w:type="spellEnd"/>
             <w:r>
@@ -5577,6 +5544,7 @@
                 <w:lang w:eastAsia="es-MX"/>
               </w:rPr>
             </w:pPr>
+            <w:proofErr w:type="gramStart"/>
             <w:r>
               <w:rPr>
                 <w:sz w:val="18"/>
@@ -5590,7 +5558,15 @@
                 <w:sz w:val="18"/>
                 <w:szCs w:val="18"/>
               </w:rPr>
-              <w:t>valor_liquido_inflamable</w:t>
+              <w:t>valor</w:t>
+            </w:r>
+            <w:proofErr w:type="gramEnd"/>
+            <w:r>
+              <w:rPr>
+                <w:sz w:val="18"/>
+                <w:szCs w:val="18"/>
+              </w:rPr>
+              <w:t>_liquido_inflamable</w:t>
             </w:r>
             <w:proofErr w:type="spellEnd"/>
             <w:r>
@@ -5711,6 +5687,7 @@
                 <w:lang w:eastAsia="es-MX"/>
               </w:rPr>
             </w:pPr>
+            <w:proofErr w:type="gramStart"/>
             <w:r>
               <w:rPr>
                 <w:rFonts w:ascii="Calibri" w:eastAsia="Times New Roman" w:hAnsi="Calibri" w:cs="Calibri"/>
@@ -5730,7 +5707,18 @@
                 <w:szCs w:val="18"/>
                 <w:lang w:eastAsia="es-MX"/>
               </w:rPr>
-              <w:t>valor_liquido_combustible</w:t>
+              <w:t>valor</w:t>
+            </w:r>
+            <w:proofErr w:type="gramEnd"/>
+            <w:r>
+              <w:rPr>
+                <w:rFonts w:ascii="Calibri" w:eastAsia="Times New Roman" w:hAnsi="Calibri" w:cs="Calibri"/>
+                <w:color w:val="000000"/>
+                <w:sz w:val="18"/>
+                <w:szCs w:val="18"/>
+                <w:lang w:eastAsia="es-MX"/>
+              </w:rPr>
+              <w:t>_liquido_combustible</w:t>
             </w:r>
             <w:proofErr w:type="spellEnd"/>
             <w:r>
@@ -5854,6 +5842,7 @@
                 <w:lang w:eastAsia="es-MX"/>
               </w:rPr>
             </w:pPr>
+            <w:proofErr w:type="gramStart"/>
             <w:r>
               <w:rPr>
                 <w:sz w:val="18"/>
@@ -5867,7 +5856,15 @@
                 <w:sz w:val="18"/>
                 <w:szCs w:val="18"/>
               </w:rPr>
-              <w:t>valor_solido_combustible</w:t>
+              <w:t>valor</w:t>
+            </w:r>
+            <w:proofErr w:type="gramEnd"/>
+            <w:r>
+              <w:rPr>
+                <w:sz w:val="18"/>
+                <w:szCs w:val="18"/>
+              </w:rPr>
+              <w:t>_solido_combustible</w:t>
             </w:r>
             <w:proofErr w:type="spellEnd"/>
             <w:r>
@@ -6109,6 +6106,7 @@
                 <w:lang w:eastAsia="es-MX"/>
               </w:rPr>
             </w:pPr>
+            <w:proofErr w:type="gramStart"/>
             <w:r>
               <w:rPr>
                 <w:rFonts w:ascii="Calibri" w:eastAsia="Times New Roman" w:hAnsi="Calibri" w:cs="Calibri"/>
@@ -6127,6 +6125,7 @@
               <w:t>dia</w:t>
             </w:r>
             <w:proofErr w:type="spellEnd"/>
+            <w:proofErr w:type="gramEnd"/>
             <w:r>
               <w:rPr>
                 <w:rFonts w:ascii="Calibri" w:eastAsia="Times New Roman" w:hAnsi="Calibri" w:cs="Calibri"/>
@@ -6263,13 +6262,23 @@
                 <w:lang w:eastAsia="es-MX"/>
               </w:rPr>
             </w:pPr>
-            <w:r>
-              <w:rPr>
-                <w:rFonts w:ascii="Calibri" w:eastAsia="Times New Roman" w:hAnsi="Calibri" w:cs="Calibri"/>
-                <w:color w:val="000000"/>
-                <w:lang w:eastAsia="es-MX"/>
-              </w:rPr>
-              <w:t>{{ construccion_m2 }}</w:t>
+            <w:proofErr w:type="gramStart"/>
+            <w:r>
+              <w:rPr>
+                <w:rFonts w:ascii="Calibri" w:eastAsia="Times New Roman" w:hAnsi="Calibri" w:cs="Calibri"/>
+                <w:color w:val="000000"/>
+                <w:lang w:eastAsia="es-MX"/>
+              </w:rPr>
+              <w:t>{{ construccion</w:t>
+            </w:r>
+            <w:proofErr w:type="gramEnd"/>
+            <w:r>
+              <w:rPr>
+                <w:rFonts w:ascii="Calibri" w:eastAsia="Times New Roman" w:hAnsi="Calibri" w:cs="Calibri"/>
+                <w:color w:val="000000"/>
+                <w:lang w:eastAsia="es-MX"/>
+              </w:rPr>
+              <w:t>_m2 }}</w:t>
             </w:r>
           </w:p>
         </w:tc>
@@ -6357,6 +6366,7 @@
                 <w:lang w:eastAsia="es-MX"/>
               </w:rPr>
             </w:pPr>
+            <w:proofErr w:type="gramStart"/>
             <w:r>
               <w:rPr>
                 <w:rFonts w:ascii="Calibri" w:eastAsia="Times New Roman" w:hAnsi="Calibri" w:cs="Calibri"/>
@@ -6380,7 +6390,20 @@
                 <w:szCs w:val="18"/>
                 <w:lang w:eastAsia="es-MX"/>
               </w:rPr>
-              <w:t>tipo_riesgo</w:t>
+              <w:t>tipo</w:t>
+            </w:r>
+            <w:proofErr w:type="gramEnd"/>
+            <w:r>
+              <w:rPr>
+                <w:rFonts w:ascii="Calibri" w:eastAsia="Times New Roman" w:hAnsi="Calibri" w:cs="Calibri"/>
+                <w:b/>
+                <w:bCs/>
+                <w:color w:val="FF0000"/>
+                <w:sz w:val="18"/>
+                <w:szCs w:val="18"/>
+                <w:lang w:eastAsia="es-MX"/>
+              </w:rPr>
+              <w:t>_riesgo</w:t>
             </w:r>
             <w:proofErr w:type="spellEnd"/>
             <w:r>
@@ -6689,6 +6712,7 @@
               </w:rPr>
               <w:t xml:space="preserve"> </w:t>
             </w:r>
+            <w:proofErr w:type="gramStart"/>
             <w:r>
               <w:rPr>
                 <w:rFonts w:ascii="Calibri" w:eastAsia="Times New Roman" w:hAnsi="Calibri" w:cs="Calibri"/>
@@ -6712,7 +6736,20 @@
                 <w:szCs w:val="28"/>
                 <w:lang w:eastAsia="es-MX"/>
               </w:rPr>
-              <w:t>giro_comercial</w:t>
+              <w:t>giro</w:t>
+            </w:r>
+            <w:proofErr w:type="gramEnd"/>
+            <w:r>
+              <w:rPr>
+                <w:rFonts w:ascii="Calibri" w:eastAsia="Times New Roman" w:hAnsi="Calibri" w:cs="Calibri"/>
+                <w:b/>
+                <w:bCs/>
+                <w:color w:val="000000"/>
+                <w:sz w:val="28"/>
+                <w:szCs w:val="28"/>
+                <w:lang w:eastAsia="es-MX"/>
+              </w:rPr>
+              <w:t>_comercial</w:t>
             </w:r>
             <w:proofErr w:type="spellEnd"/>
             <w:r>
@@ -7000,15 +7037,27 @@
                 <w:lang w:eastAsia="es-MX"/>
               </w:rPr>
             </w:pPr>
-            <w:r>
-              <w:rPr>
-                <w:rFonts w:ascii="Calibri" w:eastAsia="Times New Roman" w:hAnsi="Calibri" w:cs="Calibri"/>
-                <w:color w:val="000000"/>
-                <w:sz w:val="18"/>
-                <w:szCs w:val="18"/>
-                <w:lang w:eastAsia="es-MX"/>
-              </w:rPr>
-              <w:t>{{ cocina }}</w:t>
+            <w:proofErr w:type="gramStart"/>
+            <w:r>
+              <w:rPr>
+                <w:rFonts w:ascii="Calibri" w:eastAsia="Times New Roman" w:hAnsi="Calibri" w:cs="Calibri"/>
+                <w:color w:val="000000"/>
+                <w:sz w:val="18"/>
+                <w:szCs w:val="18"/>
+                <w:lang w:eastAsia="es-MX"/>
+              </w:rPr>
+              <w:t>{{ cocina</w:t>
+            </w:r>
+            <w:proofErr w:type="gramEnd"/>
+            <w:r>
+              <w:rPr>
+                <w:rFonts w:ascii="Calibri" w:eastAsia="Times New Roman" w:hAnsi="Calibri" w:cs="Calibri"/>
+                <w:color w:val="000000"/>
+                <w:sz w:val="18"/>
+                <w:szCs w:val="18"/>
+                <w:lang w:eastAsia="es-MX"/>
+              </w:rPr>
+              <w:t xml:space="preserve"> }}</w:t>
             </w:r>
           </w:p>
         </w:tc>
@@ -7626,6 +7675,7 @@
                 <w:lang w:eastAsia="es-MX"/>
               </w:rPr>
             </w:pPr>
+            <w:proofErr w:type="gramStart"/>
             <w:r>
               <w:rPr>
                 <w:rFonts w:ascii="Calibri" w:eastAsia="Times New Roman" w:hAnsi="Calibri" w:cs="Calibri"/>
@@ -7641,7 +7691,16 @@
                 <w:color w:val="000000"/>
                 <w:lang w:eastAsia="es-MX"/>
               </w:rPr>
-              <w:t>observaciones_k</w:t>
+              <w:t>observaciones</w:t>
+            </w:r>
+            <w:proofErr w:type="gramEnd"/>
+            <w:r>
+              <w:rPr>
+                <w:rFonts w:ascii="Calibri" w:eastAsia="Times New Roman" w:hAnsi="Calibri" w:cs="Calibri"/>
+                <w:color w:val="000000"/>
+                <w:lang w:eastAsia="es-MX"/>
+              </w:rPr>
+              <w:t>_k</w:t>
             </w:r>
             <w:proofErr w:type="spellEnd"/>
             <w:r>
@@ -7951,13 +8010,23 @@
                 <w:lang w:eastAsia="es-MX"/>
               </w:rPr>
             </w:pPr>
-            <w:r>
-              <w:rPr>
-                <w:rFonts w:ascii="Calibri" w:eastAsia="Times New Roman" w:hAnsi="Calibri" w:cs="Calibri"/>
-                <w:color w:val="000000"/>
-                <w:lang w:eastAsia="es-MX"/>
-              </w:rPr>
-              <w:t>{{ extintor }}</w:t>
+            <w:proofErr w:type="gramStart"/>
+            <w:r>
+              <w:rPr>
+                <w:rFonts w:ascii="Calibri" w:eastAsia="Times New Roman" w:hAnsi="Calibri" w:cs="Calibri"/>
+                <w:color w:val="000000"/>
+                <w:lang w:eastAsia="es-MX"/>
+              </w:rPr>
+              <w:t>{{ extintor</w:t>
+            </w:r>
+            <w:proofErr w:type="gramEnd"/>
+            <w:r>
+              <w:rPr>
+                <w:rFonts w:ascii="Calibri" w:eastAsia="Times New Roman" w:hAnsi="Calibri" w:cs="Calibri"/>
+                <w:color w:val="000000"/>
+                <w:lang w:eastAsia="es-MX"/>
+              </w:rPr>
+              <w:t xml:space="preserve"> }}</w:t>
             </w:r>
           </w:p>
         </w:tc>
@@ -9327,6 +9396,7 @@
                 <w:lang w:eastAsia="es-MX"/>
               </w:rPr>
             </w:pPr>
+            <w:proofErr w:type="gramStart"/>
             <w:r>
               <w:rPr>
                 <w:rFonts w:ascii="Calibri" w:eastAsia="Times New Roman" w:hAnsi="Calibri" w:cs="Calibri"/>
@@ -9346,7 +9416,18 @@
                 <w:color w:val="000000"/>
                 <w:lang w:eastAsia="es-MX"/>
               </w:rPr>
-              <w:t>ext_distancia</w:t>
+              <w:t>ext</w:t>
+            </w:r>
+            <w:proofErr w:type="gramEnd"/>
+            <w:r>
+              <w:rPr>
+                <w:rFonts w:ascii="Calibri" w:eastAsia="Times New Roman" w:hAnsi="Calibri" w:cs="Calibri"/>
+                <w:b/>
+                <w:bCs/>
+                <w:color w:val="000000"/>
+                <w:lang w:eastAsia="es-MX"/>
+              </w:rPr>
+              <w:t>_distancia</w:t>
             </w:r>
             <w:proofErr w:type="spellEnd"/>
             <w:r>
@@ -11084,14 +11165,7 @@
                               <w:sz w:val="18"/>
                               <w:szCs w:val="18"/>
                             </w:rPr>
-                            <w:t xml:space="preserve">CONSULTOR: NOE MORA </w:t>
-                          </w:r>
-                          <w:r>
-                            <w:rPr>
-                              <w:sz w:val="18"/>
-                              <w:szCs w:val="18"/>
-                            </w:rPr>
-                            <w:t>RAMIREZ</w:t>
+                            <w:t>CONSULTOR: NOE MORA RAMIREZ</w:t>
                           </w:r>
                         </w:p>
                         <w:p>
@@ -11449,6 +11523,7 @@
       </w:rPr>
       <w:t xml:space="preserve">L </w:t>
     </w:r>
+    <w:proofErr w:type="gramStart"/>
     <w:r>
       <w:rPr>
         <w:color w:val="A6A6A6" w:themeColor="background1" w:themeShade="A6"/>
@@ -11471,6 +11546,7 @@
       <w:t>anio</w:t>
     </w:r>
     <w:proofErr w:type="spellEnd"/>
+    <w:proofErr w:type="gramEnd"/>
     <w:r>
       <w:rPr>
         <w:color w:val="A6A6A6" w:themeColor="background1" w:themeShade="A6"/>

</xml_diff>

<commit_message>
logo2 a heigth y ajustes a plantillas
</commit_message>
<xml_diff>
--- a/Inputs/Templates/GRI Banorte.docx
+++ b/Inputs/Templates/GRI Banorte.docx
@@ -171,10 +171,23 @@
           <w:b/>
           <w:sz w:val="24"/>
           <w:szCs w:val="24"/>
+        </w:rPr>
+      </w:pPr>
+    </w:p>
+    <w:p>
+      <w:pPr>
+        <w:autoSpaceDE w:val="0"/>
+        <w:autoSpaceDN w:val="0"/>
+        <w:adjustRightInd w:val="0"/>
+        <w:spacing w:after="0" w:line="240" w:lineRule="auto"/>
+        <w:jc w:val="center"/>
+        <w:rPr>
+          <w:b/>
+          <w:sz w:val="24"/>
+          <w:szCs w:val="24"/>
           <w:lang w:val="es-ES"/>
         </w:rPr>
       </w:pPr>
-      <w:proofErr w:type="gramStart"/>
       <w:r>
         <w:rPr>
           <w:b/>
@@ -193,7 +206,6 @@
         <w:t>Direccion</w:t>
       </w:r>
       <w:proofErr w:type="spellEnd"/>
-      <w:proofErr w:type="gramEnd"/>
       <w:r>
         <w:rPr>
           <w:b/>
@@ -266,7 +278,6 @@
           <w:szCs w:val="24"/>
         </w:rPr>
       </w:pPr>
-      <w:proofErr w:type="gramStart"/>
       <w:r>
         <w:rPr>
           <w:b/>
@@ -282,16 +293,7 @@
           <w:sz w:val="24"/>
           <w:szCs w:val="24"/>
         </w:rPr>
-        <w:t>descripcion</w:t>
-      </w:r>
-      <w:proofErr w:type="gramEnd"/>
-      <w:r>
-        <w:rPr>
-          <w:b/>
-          <w:sz w:val="24"/>
-          <w:szCs w:val="24"/>
-        </w:rPr>
-        <w:t>_actividades</w:t>
+        <w:t>descripcion_actividades</w:t>
       </w:r>
       <w:proofErr w:type="spellEnd"/>
       <w:r>
@@ -374,7 +376,6 @@
         </w:rPr>
         <w:t xml:space="preserve">SE CUENTA CON </w:t>
       </w:r>
-      <w:proofErr w:type="gramStart"/>
       <w:r>
         <w:rPr>
           <w:b/>
@@ -382,17 +383,7 @@
           <w:sz w:val="24"/>
           <w:szCs w:val="24"/>
         </w:rPr>
-        <w:t>{{ trabajadores</w:t>
-      </w:r>
-      <w:proofErr w:type="gramEnd"/>
-      <w:r>
-        <w:rPr>
-          <w:b/>
-          <w:bCs/>
-          <w:sz w:val="24"/>
-          <w:szCs w:val="24"/>
-        </w:rPr>
-        <w:t xml:space="preserve"> }}</w:t>
+        <w:t>{{ trabajadores }}</w:t>
       </w:r>
       <w:r>
         <w:rPr>
@@ -503,7 +494,6 @@
         </w:rPr>
         <w:t xml:space="preserve">: </w:t>
       </w:r>
-      <w:proofErr w:type="gramStart"/>
       <w:r>
         <w:rPr>
           <w:b/>
@@ -511,17 +501,7 @@
           <w:sz w:val="24"/>
           <w:szCs w:val="24"/>
         </w:rPr>
-        <w:t>{{ proveedores</w:t>
-      </w:r>
-      <w:proofErr w:type="gramEnd"/>
-      <w:r>
-        <w:rPr>
-          <w:b/>
-          <w:bCs/>
-          <w:sz w:val="24"/>
-          <w:szCs w:val="24"/>
-        </w:rPr>
-        <w:t xml:space="preserve"> }}</w:t>
+        <w:t>{{ proveedores }}</w:t>
       </w:r>
     </w:p>
     <w:p>
@@ -554,27 +534,7 @@
           <w:sz w:val="24"/>
           <w:szCs w:val="24"/>
         </w:rPr>
-        <w:t xml:space="preserve"> </w:t>
-      </w:r>
-      <w:proofErr w:type="gramStart"/>
-      <w:r>
-        <w:rPr>
-          <w:b/>
-          <w:bCs/>
-          <w:sz w:val="24"/>
-          <w:szCs w:val="24"/>
-        </w:rPr>
-        <w:t>{{ visitantes</w:t>
-      </w:r>
-      <w:proofErr w:type="gramEnd"/>
-      <w:r>
-        <w:rPr>
-          <w:b/>
-          <w:bCs/>
-          <w:sz w:val="24"/>
-          <w:szCs w:val="24"/>
-        </w:rPr>
-        <w:t xml:space="preserve"> }} VARIABLE</w:t>
+        <w:t xml:space="preserve"> {{ visitantes }} VARIABLE</w:t>
       </w:r>
     </w:p>
     <w:p>
@@ -627,23 +587,7 @@
           <w:sz w:val="24"/>
           <w:szCs w:val="24"/>
         </w:rPr>
-        <w:t xml:space="preserve">DE </w:t>
-      </w:r>
-      <w:proofErr w:type="gramStart"/>
-      <w:r>
-        <w:rPr>
-          <w:sz w:val="24"/>
-          <w:szCs w:val="24"/>
-        </w:rPr>
-        <w:t>{{ construccion</w:t>
-      </w:r>
-      <w:proofErr w:type="gramEnd"/>
-      <w:r>
-        <w:rPr>
-          <w:sz w:val="24"/>
-          <w:szCs w:val="24"/>
-        </w:rPr>
-        <w:t xml:space="preserve">_m2 }} </w:t>
+        <w:t xml:space="preserve">DE {{ construccion_m2 }} </w:t>
       </w:r>
       <w:r>
         <w:rPr>

</xml_diff>